<commit_message>
Paula Fernandes: revisão da Parte 2
Co-Authored-By: Claude Opus 5.5 <noreply@anthropic.com>
Claude-Session: https://claude.ai/code/session_01MJjUEEZrxQDEUifKK2vj9g
</commit_message>
<xml_diff>
--- a/roteiros/paula-fernandes/Paula_Parte2.docx
+++ b/roteiros/paula-fernandes/Paula_Parte2.docx
@@ -95,7 +95,7 @@
         <w:rPr>
           <w:color w:val="C00000"/>
         </w:rPr>
-        <w:t>Guarde esse sofá na sua cabeça. Porque foi dele que Paula levantou, numa noite daquele período, para fazer a coisa mais sombria que já passou pela cabeça dela. E o que aconteceu naquela noite ela só teve coragem de contar ao público muitos anos depois.</w:t>
+        <w:t>Guarde esse sofá na sua cabeça. Porque foi nesse mesmo período, longe de qualquer palco, que Paula viveu a noite mais sombria da vida dela. E o que aconteceu naquela noite ela só teve coragem de contar ao público muitos anos depois.</w:t>
       </w:r>
     </w:p>
     <w:p>
@@ -183,7 +183,7 @@
         <w:rPr>
           <w:color w:val="000000"/>
         </w:rPr>
-        <w:t>Quando a saudade apertava, Paula pegava o violão e ia cantar em barzinhos pequenos de Belo Horizonte. Mesas de plástico, pouca gente, barulho de copo e conversa alta.</w:t>
+        <w:t>Quando a saudade apertava, Paula ia cantar em barzinhos pequenos de Belo Horizonte. Mesas de plástico, pouca gente, barulho de copo e conversa alta.</w:t>
       </w:r>
     </w:p>
     <w:p>
@@ -303,7 +303,7 @@
         <w:rPr>
           <w:color w:val="000000"/>
         </w:rPr>
-        <w:t>Era a primeira vez, em mais de dez anos de carreira, que alguém importante prestava atenção nela.</w:t>
+        <w:t>Depois de mais de dez anos de carreira, a crítica também começava a prestar atenção nela.</w:t>
       </w:r>
     </w:p>
     <w:p>
@@ -437,7 +437,7 @@
     <w:p>
       <w:r>
         <w:rPr>
-          <w:color w:val="000000"/>
+          <w:color w:val="C00000"/>
         </w:rPr>
         <w:t>Lembre da botina. Da menina de calça jeans suja de terra, andando pelo pasto numa fazenda sem luz elétrica em Sete Lagoas.</w:t>
       </w:r>
@@ -511,7 +511,7 @@
         <w:rPr>
           <w:color w:val="000000"/>
         </w:rPr>
-        <w:t>Agora volte ao disco de vinil. O primeiro disco, independente, gravado quando ela ainda era criança, que quase ninguém conheceu.</w:t>
+        <w:t>Volte ao disco de vinil. O primeiro disco, independente, gravado quando ela ainda era criança, que quase ninguém conheceu.</w:t>
       </w:r>
     </w:p>
     <w:p>
@@ -575,7 +575,7 @@
         <w:rPr>
           <w:color w:val="000000"/>
         </w:rPr>
-        <w:t>O público via a cantora de sorriso tímido, vestido longo e voz doce. Ninguém imaginava que, poucos anos antes, aquela mesma mulher quase não tinha chegado aos dezoito.</w:t>
+        <w:t>O público via a cantora de sorriso tímido, vestido longo e voz doce. Ninguém imaginava que, poucos anos antes, aquela mesma mulher quase não tinha sobrevivido à própria adolescência.</w:t>
       </w:r>
     </w:p>
     <w:p>
@@ -671,7 +671,7 @@
         <w:rPr>
           <w:color w:val="000000"/>
         </w:rPr>
-        <w:t>Pouco depois, num show, Paula falou desse renascimento diante do público. Emocionada, com lágrimas no rosto, disse que a vida podia acabar em poucos dias, e que por isso queria viver tudo o que ainda não tinha vivido.</w:t>
+        <w:t>Na comemoração do aniversário, Paula falou desse renascimento. Emocionada, com lágrimas no rosto, disse que tinha apenas poucos dias de vida. Ela contava a vida nova a partir da noite do acidente, e queria que essa vida fosse maravilhosa.</w:t>
       </w:r>
     </w:p>
     <w:p>
@@ -679,7 +679,7 @@
         <w:rPr>
           <w:color w:val="000000"/>
         </w:rPr>
-        <w:t>Alguém filmou aquele momento.</w:t>
+        <w:t>Alguém guardou aquele vídeo.</w:t>
       </w:r>
     </w:p>
     <w:p>
@@ -687,7 +687,7 @@
         <w:rPr>
           <w:color w:val="000000"/>
         </w:rPr>
-        <w:t>O vídeo caiu nas redes sociais e se espalhou cortado, sem contexto. Em pouco tempo, milhares de pessoas estavam compartilhando a notícia de que Paula Fernandes tinha uma doença terminal e só tinha alguns dias de vida.</w:t>
+        <w:t>Quase dois anos depois, em dois mil e vinte e quatro, ele voltou a circular nas redes, cortado e sem contexto. Milhares de pessoas passaram a compartilhar a notícia de que Paula Fernandes tinha uma doença terminal e só tinha alguns dias de vida.</w:t>
       </w:r>
     </w:p>
     <w:p>
@@ -703,7 +703,7 @@
         <w:rPr>
           <w:color w:val="000000"/>
         </w:rPr>
-        <w:t>Mas o boato correu o Brasil, e muita gente acreditou.</w:t>
+        <w:t>O boato correu o Brasil mesmo assim, e muita gente acreditou.</w:t>
       </w:r>
     </w:p>
     <w:p>
@@ -711,7 +711,7 @@
         <w:rPr>
           <w:color w:val="C00000"/>
         </w:rPr>
-        <w:t>O mais cruel é que, enquanto o país discutia uma doença que nunca existiu, ninguém perguntava pela ferida verdadeira. Aquela que ela carregava desde os dezoito anos.</w:t>
+        <w:t>O mais cruel é que, enquanto o país discutia uma doença que nunca existiu, quase ninguém se lembrava da ferida verdadeira. Aquela que ela tinha revelado em dois mil e vinte e dois, poucos dias depois do acidente.</w:t>
       </w:r>
     </w:p>
     <w:p>
@@ -719,7 +719,7 @@
         <w:rPr>
           <w:color w:val="000000"/>
         </w:rPr>
-        <w:t>Duas semanas depois, numa conversa num podcast, Paula revelou que já tinha estado perto do fim antes. Muito antes do acidente. E dessa vez não tinha sido por acaso.</w:t>
+        <w:t>Duas semanas depois de o carro capotar, numa conversa num podcast, Paula contou que já tinha estado perto do fim antes. Muito antes do acidente. Só que, daquela vez, o perigo tinha vindo de dentro dela.</w:t>
       </w:r>
     </w:p>
     <w:p>

</xml_diff>